<commit_message>
前端库本地化：Bootstrap 5.3.3 / Bootstrap Icons 1.11.3 改由本站 wwwroot/lib 提供，不再依赖 jsdelivr CDN
Co-Authored-By: Claude Sonnet 5 <noreply@anthropic.com>
</commit_message>
<xml_diff>
--- a/docs/考勤系统更新日志_完整版.docx
+++ b/docs/考勤系统更新日志_完整版.docx
@@ -134,6 +134,46 @@
           <w:lang w:eastAsia="zh-CN"/>
         </w:rPr>
         <w:t>2026-09-24</w:t>
+      </w:r>
+    </w:p>
+    <w:p>
+      <w:pPr>
+        <w:ind w:left="283"/>
+        <w:rPr>
+          <w:lang w:eastAsia="zh-CN"/>
+        </w:rPr>
+      </w:pPr>
+      <w:r>
+        <w:rPr>
+          <w:lang w:eastAsia="zh-CN"/>
+        </w:rPr>
+        <w:t xml:space="preserve">• </w:t>
+      </w:r>
+      <w:r>
+        <w:rPr>
+          <w:b/>
+          <w:lang w:eastAsia="zh-CN"/>
+        </w:rPr>
+        <w:t>页面样式、弹窗、图标不再依赖外网 CDN（防止 CDN 出问题时整站样式错乱）</w:t>
+      </w:r>
+      <w:r>
+        <w:rPr>
+          <w:lang w:eastAsia="zh-CN"/>
+        </w:rPr>
+        <w:t>：以前所有页面的样式、弹窗组件和图标都是从境外的 jsdelivr 网站现场下载的，那个网站在国内偶尔很慢或打不开，一旦出问题就会出现登录页乱掉、所有弹窗点不开、图标全变成方框，员工基本没法用。现在这些文件（Bootstrap 5.3.3、Bootstrap Icons 1.11.3，共约 0.6MB）直接放在系统服务器自己身上，页面加载不再访问任何外部网站，速度也更快。</w:t>
+      </w:r>
+      <w:r>
+        <w:rPr>
+          <w:b/>
+          <w:lang w:eastAsia="zh-CN"/>
+        </w:rPr>
+        <w:t>只有"考勤组→定位打卡地点"里的高德地图仍需要联网</w:t>
+      </w:r>
+      <w:r>
+        <w:rPr>
+          <w:lang w:eastAsia="zh-CN"/>
+        </w:rPr>
+        <w:t>（地图本身不可能离线）。以后要升级这两个库，需要手动替换 `wwwroot/lib/` 下的文件。</w:t>
       </w:r>
     </w:p>
     <w:p>

</xml_diff>